<commit_message>
Atualiza cálculo com a data da citação (17/11/2025)
Co-Authored-By: Claude Opus 5.5 <noreply@anthropic.com>
Claude-Session: https://claude.ai/code/session_01Xsu4pqVYrCnjVCP87tgm6x
</commit_message>
<xml_diff>
--- a/0800633-40.2025 - Maria dos Milagres/Cumprimento de sentença - Maria dos Milagres.docx
+++ b/0800633-40.2025 - Maria dos Milagres/Cumprimento de sentença - Maria dos Milagres.docx
@@ -415,20 +415,11 @@
       </w:r>
       <w:r>
         <w:rPr>
-          <w:b/>
-          <w:i w:val="0"/>
-          <w:highlight w:val="yellow"/>
-          <w:u w:val="none"/>
-        </w:rPr>
-        <w:t>[20/10/2025 – conferir ID ___]</w:t>
-      </w:r>
-      <w:r>
-        <w:rPr>
           <w:b w:val="0"/>
           <w:i w:val="0"/>
           <w:u w:val="none"/>
         </w:rPr>
-        <w:t>;</w:t>
+        <w:t>17/11/2025;</w:t>
       </w:r>
     </w:p>
     <w:p>
@@ -621,7 +612,7 @@
               <w:rPr>
                 <w:sz w:val="20"/>
               </w:rPr>
-              <w:t>1,144079</w:t>
+              <w:t>1,132200</w:t>
             </w:r>
           </w:p>
         </w:tc>
@@ -638,7 +629,7 @@
               <w:rPr>
                 <w:sz w:val="20"/>
               </w:rPr>
-              <w:t>R$ 38.037,66</w:t>
+              <w:t>R$ 37.642,72</w:t>
             </w:r>
           </w:p>
         </w:tc>
@@ -780,7 +771,7 @@
               <w:rPr>
                 <w:sz w:val="20"/>
               </w:rPr>
-              <w:t>R$ 40.097,81</w:t>
+              <w:t>R$ 39.702,87</w:t>
             </w:r>
           </w:p>
         </w:tc>
@@ -851,7 +842,7 @@
               <w:rPr>
                 <w:sz w:val="20"/>
               </w:rPr>
-              <w:t>R$ 4.009,78</w:t>
+              <w:t>R$ 3.970,29</w:t>
             </w:r>
           </w:p>
         </w:tc>
@@ -931,7 +922,7 @@
                 <w:color w:val="FFFFFF"/>
                 <w:sz w:val="20"/>
               </w:rPr>
-              <w:t>R$ 44.107,59</w:t>
+              <w:t>R$ 43.673,16</w:t>
             </w:r>
           </w:p>
         </w:tc>
@@ -958,7 +949,7 @@
           <w:i w:val="0"/>
           <w:u w:val="none"/>
         </w:rPr>
-        <w:t>R$ 44.107,59 (quarenta e quatro mil, cento e sete reais e cinquenta e nove centavos)</w:t>
+        <w:t>R$ 43.673,16 (quarenta e três mil, seiscentos e setenta e três reais e dezesseis centavos)</w:t>
       </w:r>
       <w:r>
         <w:rPr>
@@ -1060,7 +1051,7 @@
           <w:i w:val="0"/>
           <w:u w:val="none"/>
         </w:rPr>
-        <w:t xml:space="preserve">Nessa hipótese, sobre o total de R$ 44.107,59 incidirão multa de R$ 4.410,76 e honorários de R$ 4.410,76, perfazendo </w:t>
+        <w:t xml:space="preserve">Nessa hipótese, sobre o total de R$ 43.673,16 incidirão multa de R$ 4.367,32 e honorários de R$ 4.367,32, perfazendo </w:t>
       </w:r>
       <w:r>
         <w:rPr>
@@ -1068,7 +1059,7 @@
           <w:i w:val="0"/>
           <w:u w:val="none"/>
         </w:rPr>
-        <w:t>R$ 52.929,11 (cinquenta e dois mil, novecentos e vinte e nove reais e onze centavos)</w:t>
+        <w:t>R$ 52.407,80 (cinquenta e dois mil, quatrocentos e sete reais e oitenta centavos)</w:t>
       </w:r>
       <w:r>
         <w:rPr>
@@ -1130,7 +1121,7 @@
           <w:i w:val="0"/>
           <w:u w:val="none"/>
         </w:rPr>
-        <w:t>a intimação dos Executados, na pessoa de seu advogado constituído nos autos, nos termos do art. 513, § 2º, inciso I, do CPC, para que, solidariamente, efetuem o pagamento do débito de R$ 44.107,59 (quarenta e quatro mil, cento e sete reais e cinquenta e nove centavos), atualizado até a data do efetivo pagamento, no prazo de 15 (quinze) dias;</w:t>
+        <w:t>a intimação dos Executados, na pessoa de seu advogado constituído nos autos, nos termos do art. 513, § 2º, inciso I, do CPC, para que, solidariamente, efetuem o pagamento do débito de R$ 43.673,16 (quarenta e três mil, seiscentos e setenta e três reais e dezesseis centavos), atualizado até a data do efetivo pagamento, no prazo de 15 (quinze) dias;</w:t>
       </w:r>
     </w:p>
     <w:p>

</xml_diff>

<commit_message>
Atualiza SELIC (AASP/CFC: ago/2026 1,09% e set/2026 1,08%) e recalcula
Co-Authored-By: Claude Opus 5.5 <noreply@anthropic.com>
Claude-Session: https://claude.ai/code/session_01Xsu4pqVYrCnjVCP87tgm6x
</commit_message>
<xml_diff>
--- a/0800633-40.2025 - Maria dos Milagres/Cumprimento de sentença - Maria dos Milagres.docx
+++ b/0800633-40.2025 - Maria dos Milagres/Cumprimento de sentença - Maria dos Milagres.docx
@@ -612,7 +612,7 @@
               <w:rPr>
                 <w:sz w:val="20"/>
               </w:rPr>
-              <w:t>1,132200</w:t>
+              <w:t>1,135310</w:t>
             </w:r>
           </w:p>
         </w:tc>
@@ -629,7 +629,7 @@
               <w:rPr>
                 <w:sz w:val="20"/>
               </w:rPr>
-              <w:t>R$ 37.642,72</w:t>
+              <w:t>R$ 37.746,10</w:t>
             </w:r>
           </w:p>
         </w:tc>
@@ -683,7 +683,7 @@
               <w:rPr>
                 <w:sz w:val="20"/>
               </w:rPr>
-              <w:t>1,030075</w:t>
+              <w:t>1,032904</w:t>
             </w:r>
           </w:p>
         </w:tc>
@@ -700,7 +700,7 @@
               <w:rPr>
                 <w:sz w:val="20"/>
               </w:rPr>
-              <w:t>R$ 2.060,15</w:t>
+              <w:t>R$ 2.065,81</w:t>
             </w:r>
           </w:p>
         </w:tc>
@@ -771,7 +771,7 @@
               <w:rPr>
                 <w:sz w:val="20"/>
               </w:rPr>
-              <w:t>R$ 39.702,87</w:t>
+              <w:t>R$ 39.811,91</w:t>
             </w:r>
           </w:p>
         </w:tc>
@@ -842,7 +842,7 @@
               <w:rPr>
                 <w:sz w:val="20"/>
               </w:rPr>
-              <w:t>R$ 3.970,29</w:t>
+              <w:t>R$ 3.981,19</w:t>
             </w:r>
           </w:p>
         </w:tc>
@@ -922,7 +922,7 @@
                 <w:color w:val="FFFFFF"/>
                 <w:sz w:val="20"/>
               </w:rPr>
-              <w:t>R$ 43.673,16</w:t>
+              <w:t>R$ 43.793,10</w:t>
             </w:r>
           </w:p>
         </w:tc>
@@ -949,7 +949,7 @@
           <w:i w:val="0"/>
           <w:u w:val="none"/>
         </w:rPr>
-        <w:t>R$ 43.673,16 (quarenta e três mil, seiscentos e setenta e três reais e dezesseis centavos)</w:t>
+        <w:t>R$ 43.793,10 (quarenta e três mil, setecentos e noventa e três reais e dez centavos)</w:t>
       </w:r>
       <w:r>
         <w:rPr>
@@ -1051,7 +1051,7 @@
           <w:i w:val="0"/>
           <w:u w:val="none"/>
         </w:rPr>
-        <w:t xml:space="preserve">Nessa hipótese, sobre o total de R$ 43.673,16 incidirão multa de R$ 4.367,32 e honorários de R$ 4.367,32, perfazendo </w:t>
+        <w:t xml:space="preserve">Nessa hipótese, sobre o total de R$ 43.793,10 incidirão multa de R$ 4.379,31 e honorários de R$ 4.379,31, perfazendo </w:t>
       </w:r>
       <w:r>
         <w:rPr>
@@ -1059,7 +1059,7 @@
           <w:i w:val="0"/>
           <w:u w:val="none"/>
         </w:rPr>
-        <w:t>R$ 52.407,80 (cinquenta e dois mil, quatrocentos e sete reais e oitenta centavos)</w:t>
+        <w:t>R$ 52.551,72 (cinquenta e dois mil, quinhentos e cinquenta e um reais e setenta e dois centavos)</w:t>
       </w:r>
       <w:r>
         <w:rPr>
@@ -1121,7 +1121,7 @@
           <w:i w:val="0"/>
           <w:u w:val="none"/>
         </w:rPr>
-        <w:t>a intimação dos Executados, na pessoa de seu advogado constituído nos autos, nos termos do art. 513, § 2º, inciso I, do CPC, para que, solidariamente, efetuem o pagamento do débito de R$ 43.673,16 (quarenta e três mil, seiscentos e setenta e três reais e dezesseis centavos), atualizado até a data do efetivo pagamento, no prazo de 15 (quinze) dias;</w:t>
+        <w:t>a intimação dos Executados, na pessoa de seu advogado constituído nos autos, nos termos do art. 513, § 2º, inciso I, do CPC, para que, solidariamente, efetuem o pagamento do débito de R$ 43.793,10 (quarenta e três mil, setecentos e noventa e três reais e dez centavos), atualizado até a data do efetivo pagamento, no prazo de 15 (quinze) dias;</w:t>
       </w:r>
     </w:p>
     <w:p>

</xml_diff>

<commit_message>
Petição: inclui data do trânsito em julgado (27/10/2026)
Co-Authored-By: Claude Opus 5.5 <noreply@anthropic.com>
Claude-Session: https://claude.ai/code/session_01Xsu4pqVYrCnjVCP87tgm6x
</commit_message>
<xml_diff>
--- a/0800633-40.2025 - Maria dos Milagres/Cumprimento de sentença - Maria dos Milagres.docx
+++ b/0800633-40.2025 - Maria dos Milagres/Cumprimento de sentença - Maria dos Milagres.docx
@@ -269,41 +269,7 @@
           <w:i w:val="0"/>
           <w:u w:val="none"/>
         </w:rPr>
-        <w:t xml:space="preserve">A decisão transitou em julgado em </w:t>
-      </w:r>
-      <w:r>
-        <w:rPr>
-          <w:b/>
-          <w:i w:val="0"/>
-          <w:highlight w:val="yellow"/>
-          <w:u w:val="none"/>
-        </w:rPr>
-        <w:t>[__/__/____]</w:t>
-      </w:r>
-      <w:r>
-        <w:rPr>
-          <w:b w:val="0"/>
-          <w:i w:val="0"/>
-          <w:u w:val="none"/>
-        </w:rPr>
-        <w:t xml:space="preserve">, conforme certidão de ID </w:t>
-      </w:r>
-      <w:r>
-        <w:rPr>
-          <w:b/>
-          <w:i w:val="0"/>
-          <w:highlight w:val="yellow"/>
-          <w:u w:val="none"/>
-        </w:rPr>
-        <w:t>[________]</w:t>
-      </w:r>
-      <w:r>
-        <w:rPr>
-          <w:b w:val="0"/>
-          <w:i w:val="0"/>
-          <w:u w:val="none"/>
-        </w:rPr>
-        <w:t>, tornando o título exigível em caráter definitivo (art. 523 do CPC).</w:t>
+        <w:t>A decisão transitou em julgado em 27/10/2026, tornando o título exigível em caráter definitivo (art. 523 do CPC).</w:t>
       </w:r>
     </w:p>
     <w:p/>

</xml_diff>

<commit_message>
Inclui parcelas pagas após o ajuizamento (out/2025 a fev/2026, R$ 125,00 por contrato)
Co-Authored-By: Claude Opus 5.5 <noreply@anthropic.com>
Claude-Session: https://claude.ai/code/session_01Xsu4pqVYrCnjVCP87tgm6x
</commit_message>
<xml_diff>
--- a/0800633-40.2025 - Maria dos Milagres/Cumprimento de sentença - Maria dos Milagres.docx
+++ b/0800633-40.2025 - Maria dos Milagres/Cumprimento de sentença - Maria dos Milagres.docx
@@ -347,7 +347,115 @@
           <w:i/>
           <w:u w:val="none"/>
         </w:rPr>
-        <w:t>3.  DO DEMONSTRATIVO DO DÉBITO:</w:t>
+        <w:t>3.  DAS PARCELAS PAGAS NO CURSO DO PROCESSO:</w:t>
+      </w:r>
+    </w:p>
+    <w:p>
+      <w:pPr>
+        <w:spacing w:after="0"/>
+        <w:ind w:firstLine="850"/>
+        <w:jc w:val="both"/>
+      </w:pPr>
+      <w:r>
+        <w:rPr>
+          <w:b w:val="0"/>
+          <w:i w:val="0"/>
+          <w:u w:val="none"/>
+        </w:rPr>
+        <w:t>O valor de R$ 33.247,41 fixado no item "e" da decisão de ID 105869610 corresponde aos pagamentos demonstrados no extrato da vendedora (ID 87800028) e no relatório de pagamentos (ID 83458244), referentes ao período anterior ao ajuizamento.</w:t>
+      </w:r>
+    </w:p>
+    <w:p>
+      <w:pPr>
+        <w:spacing w:after="0"/>
+        <w:ind w:firstLine="850"/>
+        <w:jc w:val="both"/>
+      </w:pPr>
+      <w:r>
+        <w:rPr>
+          <w:b w:val="0"/>
+          <w:i w:val="0"/>
+          <w:u w:val="none"/>
+        </w:rPr>
+        <w:t xml:space="preserve">Após a propositura da ação, a Exequente continuou adimplindo as prestações mensais dos três contratos, no valor de R$ 125,00 (cento e vinte e cinco reais) cada, de outubro de 2025 a fevereiro de 2026, totalizando </w:t>
+      </w:r>
+      <w:r>
+        <w:rPr>
+          <w:b/>
+          <w:i w:val="0"/>
+          <w:u w:val="none"/>
+        </w:rPr>
+        <w:t>R$ 1.875,00 (mil, oitocentos e setenta e cinco reais)</w:t>
+      </w:r>
+      <w:r>
+        <w:rPr>
+          <w:b w:val="0"/>
+          <w:i w:val="0"/>
+          <w:u w:val="none"/>
+        </w:rPr>
+        <w:t>.</w:t>
+      </w:r>
+    </w:p>
+    <w:p>
+      <w:pPr>
+        <w:spacing w:after="0"/>
+        <w:ind w:firstLine="850"/>
+        <w:jc w:val="both"/>
+      </w:pPr>
+      <w:r>
+        <w:rPr>
+          <w:b w:val="0"/>
+          <w:i w:val="0"/>
+          <w:u w:val="none"/>
+        </w:rPr>
+        <w:t>Tais valores integram o "valor efetivamente pago" cuja restituição imediata e integral foi determinada no item I da sentença, e se incluem na condenação independentemente de declaração expressa, por se tratar de prestações sucessivas vencidas no curso do processo, nos termos do art. 323 do CPC:</w:t>
+      </w:r>
+    </w:p>
+    <w:p>
+      <w:pPr>
+        <w:spacing w:line="240" w:lineRule="auto" w:after="160"/>
+        <w:ind w:left="2268"/>
+        <w:jc w:val="both"/>
+      </w:pPr>
+      <w:r>
+        <w:rPr>
+          <w:b w:val="0"/>
+          <w:i/>
+          <w:sz w:val="18"/>
+          <w:u w:val="none"/>
+        </w:rPr>
+        <w:t>Art. 323. Na ação que tiver por objeto cumprimento de obrigação em prestações sucessivas, essas serão consideradas incluídas no pedido, independentemente de declaração expressa do autor, e serão incluídas na condenação, enquanto durar a obrigação, se o devedor, no curso do processo, deixar de pagá-las ou de consigná-las.</w:t>
+      </w:r>
+    </w:p>
+    <w:p>
+      <w:pPr>
+        <w:spacing w:after="0"/>
+        <w:ind w:firstLine="850"/>
+        <w:jc w:val="both"/>
+      </w:pPr>
+      <w:r>
+        <w:rPr>
+          <w:b w:val="0"/>
+          <w:i w:val="0"/>
+          <w:u w:val="none"/>
+        </w:rPr>
+        <w:t>Sobre essas parcelas incide a SELIC a partir da citação, para as pagas antes dela, e a partir de cada desembolso, para as posteriores, conforme detalhado na planilha anexa.</w:t>
+      </w:r>
+    </w:p>
+    <w:p/>
+    <w:p>
+      <w:pPr>
+        <w:spacing w:after="120"/>
+        <w:ind w:left="567"/>
+        <w:jc w:val="both"/>
+      </w:pPr>
+      <w:r>
+        <w:rPr>
+          <w:b/>
+          <w:i/>
+          <w:u w:val="none"/>
+        </w:rPr>
+        <w:t>4.  DO DEMONSTRATIVO DO DÉBITO:</w:t>
       </w:r>
     </w:p>
     <w:p>
@@ -386,6 +494,21 @@
           <w:u w:val="none"/>
         </w:rPr>
         <w:t>17/11/2025;</w:t>
+      </w:r>
+    </w:p>
+    <w:p>
+      <w:pPr>
+        <w:spacing w:after="80"/>
+        <w:ind w:left="850"/>
+        <w:jc w:val="both"/>
+      </w:pPr>
+      <w:r>
+        <w:rPr>
+          <w:b w:val="0"/>
+          <w:i w:val="0"/>
+          <w:u w:val="none"/>
+        </w:rPr>
+        <w:t>Parcelas pagas após o ajuizamento: R$ 1.875,00 (15 parcelas de R$ 125,00), atualizadas pela SELIC desde a citação ou desde o pagamento, se posterior;</w:t>
       </w:r>
     </w:p>
     <w:p>
@@ -615,6 +738,77 @@
                 <w:b/>
                 <w:sz w:val="20"/>
               </w:rPr>
+              <w:t>Parcelas pagas após o ajuizamento (out/2025 a fev/2026)</w:t>
+            </w:r>
+          </w:p>
+        </w:tc>
+        <w:tc>
+          <w:tcPr>
+            <w:tcW w:type="dxa" w:w="1814"/>
+          </w:tcPr>
+          <w:p>
+            <w:pPr>
+              <w:spacing w:line="276" w:lineRule="auto"/>
+              <w:jc w:val="center"/>
+            </w:pPr>
+            <w:r>
+              <w:rPr>
+                <w:sz w:val="20"/>
+              </w:rPr>
+              <w:t>R$ 1.875,00</w:t>
+            </w:r>
+          </w:p>
+        </w:tc>
+        <w:tc>
+          <w:tcPr>
+            <w:tcW w:type="dxa" w:w="1361"/>
+          </w:tcPr>
+          <w:p>
+            <w:pPr>
+              <w:spacing w:line="276" w:lineRule="auto"/>
+              <w:jc w:val="center"/>
+            </w:pPr>
+            <w:r>
+              <w:rPr>
+                <w:sz w:val="20"/>
+              </w:rPr>
+              <w:t>por parcela</w:t>
+            </w:r>
+          </w:p>
+        </w:tc>
+        <w:tc>
+          <w:tcPr>
+            <w:tcW w:type="dxa" w:w="1928"/>
+          </w:tcPr>
+          <w:p>
+            <w:pPr>
+              <w:spacing w:line="276" w:lineRule="auto"/>
+              <w:jc w:val="center"/>
+            </w:pPr>
+            <w:r>
+              <w:rPr>
+                <w:sz w:val="20"/>
+              </w:rPr>
+              <w:t>R$ 2.100,90</w:t>
+            </w:r>
+          </w:p>
+        </w:tc>
+      </w:tr>
+      <w:tr>
+        <w:tc>
+          <w:tcPr>
+            <w:tcW w:type="dxa" w:w="4195"/>
+          </w:tcPr>
+          <w:p>
+            <w:pPr>
+              <w:spacing w:line="276" w:lineRule="auto"/>
+              <w:jc w:val="left"/>
+            </w:pPr>
+            <w:r>
+              <w:rPr>
+                <w:b/>
+                <w:sz w:val="20"/>
+              </w:rPr>
               <w:t>Indenização por danos morais</w:t>
             </w:r>
           </w:p>
@@ -703,7 +897,7 @@
               <w:rPr>
                 <w:sz w:val="20"/>
               </w:rPr>
-              <w:t>R$ 35.247,41</w:t>
+              <w:t>R$ 37.122,41</w:t>
             </w:r>
           </w:p>
         </w:tc>
@@ -737,7 +931,7 @@
               <w:rPr>
                 <w:sz w:val="20"/>
               </w:rPr>
-              <w:t>R$ 39.811,91</w:t>
+              <w:t>R$ 41.912,81</w:t>
             </w:r>
           </w:p>
         </w:tc>
@@ -808,7 +1002,7 @@
               <w:rPr>
                 <w:sz w:val="20"/>
               </w:rPr>
-              <w:t>R$ 3.981,19</w:t>
+              <w:t>R$ 4.191,28</w:t>
             </w:r>
           </w:p>
         </w:tc>
@@ -888,7 +1082,7 @@
                 <w:color w:val="FFFFFF"/>
                 <w:sz w:val="20"/>
               </w:rPr>
-              <w:t>R$ 43.793,10</w:t>
+              <w:t>R$ 46.104,09</w:t>
             </w:r>
           </w:p>
         </w:tc>
@@ -915,7 +1109,7 @@
           <w:i w:val="0"/>
           <w:u w:val="none"/>
         </w:rPr>
-        <w:t>R$ 43.793,10 (quarenta e três mil, setecentos e noventa e três reais e dez centavos)</w:t>
+        <w:t>R$ 46.104,09 (quarenta e seis mil, cento e quatro reais e nove centavos)</w:t>
       </w:r>
       <w:r>
         <w:rPr>
@@ -969,7 +1163,7 @@
           <w:i/>
           <w:u w:val="none"/>
         </w:rPr>
-        <w:t>4.  DA MULTA E DOS HONORÁRIOS DO ART. 523, § 1º, DO CPC:</w:t>
+        <w:t>5.  DA MULTA E DOS HONORÁRIOS DO ART. 523, § 1º, DO CPC:</w:t>
       </w:r>
     </w:p>
     <w:p>
@@ -1017,7 +1211,7 @@
           <w:i w:val="0"/>
           <w:u w:val="none"/>
         </w:rPr>
-        <w:t xml:space="preserve">Nessa hipótese, sobre o total de R$ 43.793,10 incidirão multa de R$ 4.379,31 e honorários de R$ 4.379,31, perfazendo </w:t>
+        <w:t xml:space="preserve">Nessa hipótese, sobre o total de R$ 46.104,09 incidirão multa de R$ 4.610,41 e honorários de R$ 4.610,41, perfazendo </w:t>
       </w:r>
       <w:r>
         <w:rPr>
@@ -1025,7 +1219,7 @@
           <w:i w:val="0"/>
           <w:u w:val="none"/>
         </w:rPr>
-        <w:t>R$ 52.551,72 (cinquenta e dois mil, quinhentos e cinquenta e um reais e setenta e dois centavos)</w:t>
+        <w:t>R$ 55.324,91 (cinquenta e cinco mil, trezentos e vinte e quatro reais e noventa e um centavos)</w:t>
       </w:r>
       <w:r>
         <w:rPr>
@@ -1049,7 +1243,7 @@
           <w:i/>
           <w:u w:val="none"/>
         </w:rPr>
-        <w:t>5.  DOS PEDIDOS:</w:t>
+        <w:t>6.  DOS PEDIDOS:</w:t>
       </w:r>
     </w:p>
     <w:p>
@@ -1087,7 +1281,7 @@
           <w:i w:val="0"/>
           <w:u w:val="none"/>
         </w:rPr>
-        <w:t>a intimação dos Executados, na pessoa de seu advogado constituído nos autos, nos termos do art. 513, § 2º, inciso I, do CPC, para que, solidariamente, efetuem o pagamento do débito de R$ 43.793,10 (quarenta e três mil, setecentos e noventa e três reais e dez centavos), atualizado até a data do efetivo pagamento, no prazo de 15 (quinze) dias;</w:t>
+        <w:t>a intimação dos Executados, na pessoa de seu advogado constituído nos autos, nos termos do art. 513, § 2º, inciso I, do CPC, para que, solidariamente, efetuem o pagamento do débito de R$ 46.104,09 (quarenta e seis mil, cento e quatro reais e nove centavos), atualizado até a data do efetivo pagamento, no prazo de 15 (quinze) dias;</w:t>
       </w:r>
     </w:p>
     <w:p>

</xml_diff>

<commit_message>
Parcelas posteriores ao ajuizamento limitadas a out/2025-jan/2026
Co-Authored-By: Claude Opus 5.5 <noreply@anthropic.com>
Claude-Session: https://claude.ai/code/session_01Xsu4pqVYrCnjVCP87tgm6x
</commit_message>
<xml_diff>
--- a/0800633-40.2025 - Maria dos Milagres/Cumprimento de sentença - Maria dos Milagres.docx
+++ b/0800633-40.2025 - Maria dos Milagres/Cumprimento de sentença - Maria dos Milagres.docx
@@ -377,7 +377,7 @@
           <w:i w:val="0"/>
           <w:u w:val="none"/>
         </w:rPr>
-        <w:t xml:space="preserve">Após a propositura da ação, a Exequente continuou adimplindo as prestações mensais dos três contratos, no valor de R$ 125,00 (cento e vinte e cinco reais) cada, de outubro de 2025 a fevereiro de 2026, totalizando </w:t>
+        <w:t xml:space="preserve">Após a propositura da ação, a Exequente continuou adimplindo as prestações mensais dos três contratos, no valor de R$ 125,00 (cento e vinte e cinco reais) cada, de outubro de 2025 a janeiro de 2026, totalizando </w:t>
       </w:r>
       <w:r>
         <w:rPr>
@@ -385,7 +385,7 @@
           <w:i w:val="0"/>
           <w:u w:val="none"/>
         </w:rPr>
-        <w:t>R$ 1.875,00 (mil, oitocentos e setenta e cinco reais)</w:t>
+        <w:t>R$ 1.500,00 (mil e quinhentos reais)</w:t>
       </w:r>
       <w:r>
         <w:rPr>
@@ -508,7 +508,7 @@
           <w:i w:val="0"/>
           <w:u w:val="none"/>
         </w:rPr>
-        <w:t>Parcelas pagas após o ajuizamento: R$ 1.875,00 (15 parcelas de R$ 125,00), atualizadas pela SELIC desde a citação ou desde o pagamento, se posterior;</w:t>
+        <w:t>Parcelas pagas após o ajuizamento: R$ 1.500,00 (12 parcelas de R$ 125,00), atualizadas pela SELIC desde a citação ou desde o pagamento, se posterior;</w:t>
       </w:r>
     </w:p>
     <w:p>
@@ -738,7 +738,7 @@
                 <w:b/>
                 <w:sz w:val="20"/>
               </w:rPr>
-              <w:t>Parcelas pagas após o ajuizamento (out/2025 a fev/2026)</w:t>
+              <w:t>Parcelas pagas após o ajuizamento (out/2025 a jan/2026)</w:t>
             </w:r>
           </w:p>
         </w:tc>
@@ -755,7 +755,7 @@
               <w:rPr>
                 <w:sz w:val="20"/>
               </w:rPr>
-              <w:t>R$ 1.875,00</w:t>
+              <w:t>R$ 1.500,00</w:t>
             </w:r>
           </w:p>
         </w:tc>
@@ -789,7 +789,7 @@
               <w:rPr>
                 <w:sz w:val="20"/>
               </w:rPr>
-              <w:t>R$ 2.100,90</w:t>
+              <w:t>R$ 1.689,18</w:t>
             </w:r>
           </w:p>
         </w:tc>
@@ -897,7 +897,7 @@
               <w:rPr>
                 <w:sz w:val="20"/>
               </w:rPr>
-              <w:t>R$ 37.122,41</w:t>
+              <w:t>R$ 36.747,41</w:t>
             </w:r>
           </w:p>
         </w:tc>
@@ -931,7 +931,7 @@
               <w:rPr>
                 <w:sz w:val="20"/>
               </w:rPr>
-              <w:t>R$ 41.912,81</w:t>
+              <w:t>R$ 41.501,09</w:t>
             </w:r>
           </w:p>
         </w:tc>
@@ -1002,7 +1002,7 @@
               <w:rPr>
                 <w:sz w:val="20"/>
               </w:rPr>
-              <w:t>R$ 4.191,28</w:t>
+              <w:t>R$ 4.150,11</w:t>
             </w:r>
           </w:p>
         </w:tc>
@@ -1082,7 +1082,7 @@
                 <w:color w:val="FFFFFF"/>
                 <w:sz w:val="20"/>
               </w:rPr>
-              <w:t>R$ 46.104,09</w:t>
+              <w:t>R$ 45.651,20</w:t>
             </w:r>
           </w:p>
         </w:tc>
@@ -1109,7 +1109,7 @@
           <w:i w:val="0"/>
           <w:u w:val="none"/>
         </w:rPr>
-        <w:t>R$ 46.104,09 (quarenta e seis mil, cento e quatro reais e nove centavos)</w:t>
+        <w:t>R$ 45.651,20 (quarenta e cinco mil, seiscentos e cinquenta e um reais e vinte centavos)</w:t>
       </w:r>
       <w:r>
         <w:rPr>
@@ -1211,7 +1211,7 @@
           <w:i w:val="0"/>
           <w:u w:val="none"/>
         </w:rPr>
-        <w:t xml:space="preserve">Nessa hipótese, sobre o total de R$ 46.104,09 incidirão multa de R$ 4.610,41 e honorários de R$ 4.610,41, perfazendo </w:t>
+        <w:t xml:space="preserve">Nessa hipótese, sobre o total de R$ 45.651,20 incidirão multa de R$ 4.565,12 e honorários de R$ 4.565,12, perfazendo </w:t>
       </w:r>
       <w:r>
         <w:rPr>
@@ -1219,7 +1219,7 @@
           <w:i w:val="0"/>
           <w:u w:val="none"/>
         </w:rPr>
-        <w:t>R$ 55.324,91 (cinquenta e cinco mil, trezentos e vinte e quatro reais e noventa e um centavos)</w:t>
+        <w:t>R$ 54.781,44 (cinquenta e quatro mil, setecentos e oitenta e um reais e quarenta e quatro centavos)</w:t>
       </w:r>
       <w:r>
         <w:rPr>
@@ -1281,7 +1281,7 @@
           <w:i w:val="0"/>
           <w:u w:val="none"/>
         </w:rPr>
-        <w:t>a intimação dos Executados, na pessoa de seu advogado constituído nos autos, nos termos do art. 513, § 2º, inciso I, do CPC, para que, solidariamente, efetuem o pagamento do débito de R$ 46.104,09 (quarenta e seis mil, cento e quatro reais e nove centavos), atualizado até a data do efetivo pagamento, no prazo de 15 (quinze) dias;</w:t>
+        <w:t>a intimação dos Executados, na pessoa de seu advogado constituído nos autos, nos termos do art. 513, § 2º, inciso I, do CPC, para que, solidariamente, efetuem o pagamento do débito de R$ 45.651,20 (quarenta e cinco mil, seiscentos e cinquenta e um reais e vinte centavos), atualizado até a data do efetivo pagamento, no prazo de 15 (quinze) dias;</w:t>
       </w:r>
     </w:p>
     <w:p>

</xml_diff>

<commit_message>
Recalcula parcelas posteriores (nov/2025-jan/2026) e inclui conferência do relatório de pagamentos
Co-Authored-By: Claude Opus 5.5 <noreply@anthropic.com>
Claude-Session: https://claude.ai/code/session_01Xsu4pqVYrCnjVCP87tgm6x
</commit_message>
<xml_diff>
--- a/0800633-40.2025 - Maria dos Milagres/Cumprimento de sentença - Maria dos Milagres.docx
+++ b/0800633-40.2025 - Maria dos Milagres/Cumprimento de sentença - Maria dos Milagres.docx
@@ -362,7 +362,7 @@
           <w:i w:val="0"/>
           <w:u w:val="none"/>
         </w:rPr>
-        <w:t>O valor de R$ 33.247,41 fixado no item "e" da decisão de ID 105869610 corresponde aos pagamentos demonstrados no extrato da vendedora (ID 87800028) e no relatório de pagamentos (ID 83458244), referentes ao período anterior ao ajuizamento.</w:t>
+        <w:t>O valor de R$ 33.247,41 fixado no item "e" da decisão de ID 105869610 corresponde aos pagamentos demonstrados no extrato da vendedora (ID 87800028) e no relatório de pagamentos (ID 83458244), que totalizam R$ 32.493,39 até 01/09/2025, acrescidos das parcelas de setembro e outubro de 2025, conforme conferência constante da planilha anexa.</w:t>
       </w:r>
     </w:p>
     <w:p>
@@ -377,7 +377,7 @@
           <w:i w:val="0"/>
           <w:u w:val="none"/>
         </w:rPr>
-        <w:t xml:space="preserve">Após a propositura da ação, a Exequente continuou adimplindo as prestações mensais dos três contratos, no valor de R$ 125,00 (cento e vinte e cinco reais) cada, de outubro de 2025 a janeiro de 2026, totalizando </w:t>
+        <w:t xml:space="preserve">Após esse período, a Exequente continuou adimplindo as prestações mensais dos três contratos, no valor de R$ 125,00 (cento e vinte e cinco reais) cada, de novembro de 2025 a janeiro de 2026, totalizando </w:t>
       </w:r>
       <w:r>
         <w:rPr>
@@ -385,7 +385,7 @@
           <w:i w:val="0"/>
           <w:u w:val="none"/>
         </w:rPr>
-        <w:t>R$ 1.500,00 (mil e quinhentos reais)</w:t>
+        <w:t>R$ 1.125,00 (mil cento e vinte e cinco reais)</w:t>
       </w:r>
       <w:r>
         <w:rPr>
@@ -508,7 +508,7 @@
           <w:i w:val="0"/>
           <w:u w:val="none"/>
         </w:rPr>
-        <w:t>Parcelas pagas após o ajuizamento: R$ 1.500,00 (12 parcelas de R$ 125,00), atualizadas pela SELIC desde a citação ou desde o pagamento, se posterior;</w:t>
+        <w:t>Parcelas pagas após o ajuizamento: R$ 1.125,00 (9 parcelas de R$ 125,00), atualizadas pela SELIC desde a citação ou desde o pagamento, se posterior;</w:t>
       </w:r>
     </w:p>
     <w:p>
@@ -738,7 +738,7 @@
                 <w:b/>
                 <w:sz w:val="20"/>
               </w:rPr>
-              <w:t>Parcelas pagas após o ajuizamento (out/2025 a jan/2026)</w:t>
+              <w:t>Parcelas pagas após o ajuizamento (nov/2025 a jan/2026)</w:t>
             </w:r>
           </w:p>
         </w:tc>
@@ -755,7 +755,7 @@
               <w:rPr>
                 <w:sz w:val="20"/>
               </w:rPr>
-              <w:t>R$ 1.500,00</w:t>
+              <w:t>R$ 1.125,00</w:t>
             </w:r>
           </w:p>
         </w:tc>
@@ -789,7 +789,7 @@
               <w:rPr>
                 <w:sz w:val="20"/>
               </w:rPr>
-              <w:t>R$ 1.689,18</w:t>
+              <w:t>R$ 1.263,45</w:t>
             </w:r>
           </w:p>
         </w:tc>
@@ -897,7 +897,7 @@
               <w:rPr>
                 <w:sz w:val="20"/>
               </w:rPr>
-              <w:t>R$ 36.747,41</w:t>
+              <w:t>R$ 36.372,41</w:t>
             </w:r>
           </w:p>
         </w:tc>
@@ -931,7 +931,7 @@
               <w:rPr>
                 <w:sz w:val="20"/>
               </w:rPr>
-              <w:t>R$ 41.501,09</w:t>
+              <w:t>R$ 41.075,36</w:t>
             </w:r>
           </w:p>
         </w:tc>
@@ -1002,7 +1002,7 @@
               <w:rPr>
                 <w:sz w:val="20"/>
               </w:rPr>
-              <w:t>R$ 4.150,11</w:t>
+              <w:t>R$ 4.107,54</w:t>
             </w:r>
           </w:p>
         </w:tc>
@@ -1082,7 +1082,7 @@
                 <w:color w:val="FFFFFF"/>
                 <w:sz w:val="20"/>
               </w:rPr>
-              <w:t>R$ 45.651,20</w:t>
+              <w:t>R$ 45.182,90</w:t>
             </w:r>
           </w:p>
         </w:tc>
@@ -1109,7 +1109,7 @@
           <w:i w:val="0"/>
           <w:u w:val="none"/>
         </w:rPr>
-        <w:t>R$ 45.651,20 (quarenta e cinco mil, seiscentos e cinquenta e um reais e vinte centavos)</w:t>
+        <w:t>R$ 45.182,90 (quarenta e cinco mil, cento e oitenta e dois reais e noventa centavos)</w:t>
       </w:r>
       <w:r>
         <w:rPr>
@@ -1211,7 +1211,7 @@
           <w:i w:val="0"/>
           <w:u w:val="none"/>
         </w:rPr>
-        <w:t xml:space="preserve">Nessa hipótese, sobre o total de R$ 45.651,20 incidirão multa de R$ 4.565,12 e honorários de R$ 4.565,12, perfazendo </w:t>
+        <w:t xml:space="preserve">Nessa hipótese, sobre o total de R$ 45.182,90 incidirão multa de R$ 4.518,29 e honorários de R$ 4.518,29, perfazendo </w:t>
       </w:r>
       <w:r>
         <w:rPr>
@@ -1219,7 +1219,7 @@
           <w:i w:val="0"/>
           <w:u w:val="none"/>
         </w:rPr>
-        <w:t>R$ 54.781,44 (cinquenta e quatro mil, setecentos e oitenta e um reais e quarenta e quatro centavos)</w:t>
+        <w:t>R$ 54.219,48 (cinquenta e quatro mil, duzentos e dezenove reais e quarenta e oito centavos)</w:t>
       </w:r>
       <w:r>
         <w:rPr>
@@ -1281,7 +1281,7 @@
           <w:i w:val="0"/>
           <w:u w:val="none"/>
         </w:rPr>
-        <w:t>a intimação dos Executados, na pessoa de seu advogado constituído nos autos, nos termos do art. 513, § 2º, inciso I, do CPC, para que, solidariamente, efetuem o pagamento do débito de R$ 45.651,20 (quarenta e cinco mil, seiscentos e cinquenta e um reais e vinte centavos), atualizado até a data do efetivo pagamento, no prazo de 15 (quinze) dias;</w:t>
+        <w:t>a intimação dos Executados, na pessoa de seu advogado constituído nos autos, nos termos do art. 513, § 2º, inciso I, do CPC, para que, solidariamente, efetuem o pagamento do débito de R$ 45.182,90 (quarenta e cinco mil, cento e oitenta e dois reais e noventa centavos), atualizado até a data do efetivo pagamento, no prazo de 15 (quinze) dias;</w:t>
       </w:r>
     </w:p>
     <w:p>

</xml_diff>

<commit_message>
Remove valores da multa e honorários do art. 523, § 1º (apuração posterior)
Co-Authored-By: Claude Opus 5.5 <noreply@anthropic.com>
Claude-Session: https://claude.ai/code/session_01Xsu4pqVYrCnjVCP87tgm6x
</commit_message>
<xml_diff>
--- a/0800633-40.2025 - Maria dos Milagres/Cumprimento de sentença - Maria dos Milagres.docx
+++ b/0800633-40.2025 - Maria dos Milagres/Cumprimento de sentença - Maria dos Milagres.docx
@@ -1211,23 +1211,7 @@
           <w:i w:val="0"/>
           <w:u w:val="none"/>
         </w:rPr>
-        <w:t xml:space="preserve">Nessa hipótese, sobre o total de R$ 45.182,90 incidirão multa de R$ 4.518,29 e honorários de R$ 4.518,29, perfazendo </w:t>
-      </w:r>
-      <w:r>
-        <w:rPr>
-          <w:b/>
-          <w:i w:val="0"/>
-          <w:u w:val="none"/>
-        </w:rPr>
-        <w:t>R$ 54.219,48 (cinquenta e quatro mil, duzentos e dezenove reais e quarenta e oito centavos)</w:t>
-      </w:r>
-      <w:r>
-        <w:rPr>
-          <w:b w:val="0"/>
-          <w:i w:val="0"/>
-          <w:u w:val="none"/>
-        </w:rPr>
-        <w:t>, na data-base do cálculo.</w:t>
+        <w:t>Tais acréscimos deverão incidir sobre o débito devidamente atualizado na data em que se esgotar o prazo para pagamento voluntário, razão pela qual serão apurados oportunamente, mediante a apresentação de planilha atualizada.</w:t>
       </w:r>
     </w:p>
     <w:p/>

</xml_diff>